<commit_message>
UAT: test edilen surum v1.0.1 olarak guncellendi (md, pdf, docx)
Co-Authored-By: Claude Sonnet 5.5 <noreply@anthropic.com>
</commit_message>
<xml_diff>
--- a/docs/UAT.docx
+++ b/docs/UAT.docx
@@ -30,21 +30,9 @@
       </w:r>
       <w:r>
         <w:rPr>
-          <w:rFonts w:ascii="Consolas" w:hAnsi="Consolas"/>
+          <w:b/>
         </w:rPr>
-        <w:t>master</w:t>
-      </w:r>
-      <w:r>
-        <w:t xml:space="preserve"> – commit </w:t>
-      </w:r>
-      <w:r>
-        <w:rPr>
-          <w:rFonts w:ascii="Consolas" w:hAnsi="Consolas"/>
-        </w:rPr>
-        <w:t>07fbf9f</w:t>
-      </w:r>
-      <w:r>
-        <w:t xml:space="preserve"> ve sonrası.</w:t>
+        <w:t>v1.0.1</w:t>
       </w:r>
     </w:p>
     <w:p>

</xml_diff>

<commit_message>
UAT guncellendi: denetim kayitlari bolumu, takvim ve grafik eksen senaryolari
Co-Authored-By: Claude Sonnet 5.5 <noreply@anthropic.com>
</commit_message>
<xml_diff>
--- a/docs/UAT.docx
+++ b/docs/UAT.docx
@@ -462,7 +462,20 @@
               <w:rPr>
                 <w:sz w:val="18"/>
               </w:rPr>
-              <w:t xml:space="preserve">Başlangıç ve bitiş tarih-saat seç, </w:t>
+              <w:t xml:space="preserve">Başlangıç ve bitiş alanlarına tıkla; takvimden tarih ve saat seç. Takvimin altındaki </w:t>
+            </w:r>
+            <w:r>
+              <w:rPr>
+                <w:b/>
+                <w:sz w:val="18"/>
+              </w:rPr>
+              <w:t>Tamam</w:t>
+            </w:r>
+            <w:r>
+              <w:rPr>
+                <w:sz w:val="18"/>
+              </w:rPr>
+              <w:t xml:space="preserve">'a (veya takvimin dışına) tıkla, sonra </w:t>
             </w:r>
             <w:r>
               <w:rPr>
@@ -489,7 +502,7 @@
               <w:rPr>
                 <w:sz w:val="18"/>
               </w:rPr>
-              <w:t xml:space="preserve">Grafikler seçilen aralığı gösterir. 24 saatten uzun aralıkta etiketlerde </w:t>
+              <w:t xml:space="preserve">Takvim alanın hemen altında açılır, Tamam / dışına tıklayınca kapanır. Grafikler seçilen aralığı gösterir. 24 saatten uzun aralıkta etiketlerde </w:t>
             </w:r>
             <w:r>
               <w:rPr>
@@ -669,7 +682,7 @@
               <w:rPr>
                 <w:sz w:val="18"/>
               </w:rPr>
-              <w:t>; çizgi gerçek değişimi gösterir.</w:t>
+              <w:t xml:space="preserve"> (40–110 gibi kaymaz); çizgi gerçek değişimi gösterir, nokta işaretleri çizgiyi kalınlaştırmaz.</w:t>
             </w:r>
           </w:p>
         </w:tc>
@@ -759,7 +772,7 @@
               <w:rPr>
                 <w:sz w:val="18"/>
               </w:rPr>
-              <w:t xml:space="preserve"> görünür; çizgi değişir. Değer 25'i aşarsa eksen genişler.</w:t>
+              <w:t xml:space="preserve"> görünür (4–22 gibi kaymaz); çizgi değişir. Değer 25'i aşarsa eksen genişler.</w:t>
             </w:r>
           </w:p>
         </w:tc>
@@ -2105,7 +2118,7 @@
               <w:rPr>
                 <w:sz w:val="18"/>
               </w:rPr>
-              <w:t>Excel formunda son 1 saatlik aralık seçip indir.</w:t>
+              <w:t>Excel formundaki başlangıç/bitiş takvimlerinden son 1 saatlik aralık seç (takvim Tamam ile kapanmalı) ve indir.</w:t>
             </w:r>
           </w:p>
         </w:tc>
@@ -3143,7 +3156,1085 @@
         <w:pStyle w:val="Heading2"/>
       </w:pPr>
       <w:r>
-        <w:t>7. Sıcaklık doğruluğu</w:t>
+        <w:t>7. Denetim Kayıtları (Audit Log)</w:t>
+      </w:r>
+    </w:p>
+    <w:p>
+      <w:r>
+        <w:t>Ön koşul: Admin rolüne sahip kullanıcı ve Admin olmayan bir test kullanıcısı.</w:t>
+      </w:r>
+    </w:p>
+    <w:tbl>
+      <w:tblPr>
+        <w:tblStyle w:val="TableGrid"/>
+        <w:tblW w:type="auto" w:w="0"/>
+        <w:tblLayout w:type="autofit"/>
+        <w:tblLook w:firstColumn="1" w:firstRow="1" w:lastColumn="0" w:lastRow="0" w:noHBand="0" w:noVBand="1" w:val="04A0"/>
+      </w:tblPr>
+      <w:tblGrid>
+        <w:gridCol w:w="2523"/>
+        <w:gridCol w:w="2523"/>
+        <w:gridCol w:w="2523"/>
+        <w:gridCol w:w="2523"/>
+        <w:gridCol w:w="2523"/>
+        <w:gridCol w:w="2523"/>
+      </w:tblGrid>
+      <w:tr>
+        <w:trPr>
+          <w:tblHeader w:val="true"/>
+        </w:trPr>
+        <w:tc>
+          <w:tcPr>
+            <w:tcW w:type="dxa" w:w="2523"/>
+            <w:shd w:val="clear" w:color="auto" w:fill="E8ECF1"/>
+          </w:tcPr>
+          <w:p>
+            <w:r/>
+            <w:r>
+              <w:rPr>
+                <w:b/>
+                <w:sz w:val="18"/>
+              </w:rPr>
+              <w:t>ID</w:t>
+            </w:r>
+          </w:p>
+        </w:tc>
+        <w:tc>
+          <w:tcPr>
+            <w:tcW w:type="dxa" w:w="2523"/>
+            <w:shd w:val="clear" w:color="auto" w:fill="E8ECF1"/>
+          </w:tcPr>
+          <w:p>
+            <w:r/>
+            <w:r>
+              <w:rPr>
+                <w:b/>
+                <w:sz w:val="18"/>
+              </w:rPr>
+              <w:t>Issue</w:t>
+            </w:r>
+          </w:p>
+        </w:tc>
+        <w:tc>
+          <w:tcPr>
+            <w:tcW w:type="dxa" w:w="2523"/>
+            <w:shd w:val="clear" w:color="auto" w:fill="E8ECF1"/>
+          </w:tcPr>
+          <w:p>
+            <w:r/>
+            <w:r>
+              <w:rPr>
+                <w:b/>
+                <w:sz w:val="18"/>
+              </w:rPr>
+              <w:t>Adımlar</w:t>
+            </w:r>
+          </w:p>
+        </w:tc>
+        <w:tc>
+          <w:tcPr>
+            <w:tcW w:type="dxa" w:w="2523"/>
+            <w:shd w:val="clear" w:color="auto" w:fill="E8ECF1"/>
+          </w:tcPr>
+          <w:p>
+            <w:r/>
+            <w:r>
+              <w:rPr>
+                <w:b/>
+                <w:sz w:val="18"/>
+              </w:rPr>
+              <w:t>Beklenen sonuç</w:t>
+            </w:r>
+          </w:p>
+        </w:tc>
+        <w:tc>
+          <w:tcPr>
+            <w:tcW w:type="dxa" w:w="2523"/>
+            <w:shd w:val="clear" w:color="auto" w:fill="E8ECF1"/>
+          </w:tcPr>
+          <w:p>
+            <w:r/>
+            <w:r>
+              <w:rPr>
+                <w:b/>
+                <w:sz w:val="18"/>
+              </w:rPr>
+              <w:t>Sonuç</w:t>
+            </w:r>
+          </w:p>
+        </w:tc>
+        <w:tc>
+          <w:tcPr>
+            <w:tcW w:type="dxa" w:w="2523"/>
+            <w:shd w:val="clear" w:color="auto" w:fill="E8ECF1"/>
+          </w:tcPr>
+          <w:p>
+            <w:r/>
+            <w:r>
+              <w:rPr>
+                <w:b/>
+                <w:sz w:val="18"/>
+              </w:rPr>
+              <w:t>Not</w:t>
+            </w:r>
+          </w:p>
+        </w:tc>
+      </w:tr>
+      <w:tr>
+        <w:trPr>
+          <w:cantSplit/>
+        </w:trPr>
+        <w:tc>
+          <w:tcPr>
+            <w:tcW w:type="dxa" w:w="2523"/>
+          </w:tcPr>
+          <w:p>
+            <w:r/>
+            <w:r>
+              <w:rPr>
+                <w:sz w:val="18"/>
+              </w:rPr>
+              <w:t>A-01</w:t>
+            </w:r>
+          </w:p>
+        </w:tc>
+        <w:tc>
+          <w:tcPr>
+            <w:tcW w:type="dxa" w:w="2523"/>
+          </w:tcPr>
+          <w:p>
+            <w:r/>
+            <w:r>
+              <w:rPr>
+                <w:sz w:val="18"/>
+              </w:rPr>
+              <w:t>–</w:t>
+            </w:r>
+          </w:p>
+        </w:tc>
+        <w:tc>
+          <w:tcPr>
+            <w:tcW w:type="dxa" w:w="2523"/>
+          </w:tcPr>
+          <w:p>
+            <w:r/>
+            <w:r>
+              <w:rPr>
+                <w:sz w:val="18"/>
+              </w:rPr>
+              <w:t>Admin ile giriş yap, sol menüye bak.</w:t>
+            </w:r>
+          </w:p>
+        </w:tc>
+        <w:tc>
+          <w:tcPr>
+            <w:tcW w:type="dxa" w:w="2523"/>
+          </w:tcPr>
+          <w:p>
+            <w:r/>
+            <w:r>
+              <w:rPr>
+                <w:b/>
+                <w:sz w:val="18"/>
+              </w:rPr>
+              <w:t>Denetim Kayıtları</w:t>
+            </w:r>
+            <w:r>
+              <w:rPr>
+                <w:sz w:val="18"/>
+              </w:rPr>
+              <w:t xml:space="preserve"> menü öğesi görünür; tıklayınca sayfa açılır.</w:t>
+            </w:r>
+          </w:p>
+        </w:tc>
+        <w:tc>
+          <w:tcPr>
+            <w:tcW w:type="dxa" w:w="2523"/>
+          </w:tcPr>
+          <w:p>
+            <w:r/>
+          </w:p>
+        </w:tc>
+        <w:tc>
+          <w:tcPr>
+            <w:tcW w:type="dxa" w:w="2523"/>
+          </w:tcPr>
+          <w:p>
+            <w:r/>
+          </w:p>
+        </w:tc>
+      </w:tr>
+      <w:tr>
+        <w:trPr>
+          <w:cantSplit/>
+        </w:trPr>
+        <w:tc>
+          <w:tcPr>
+            <w:tcW w:type="dxa" w:w="2523"/>
+          </w:tcPr>
+          <w:p>
+            <w:r/>
+            <w:r>
+              <w:rPr>
+                <w:sz w:val="18"/>
+              </w:rPr>
+              <w:t>A-02</w:t>
+            </w:r>
+          </w:p>
+        </w:tc>
+        <w:tc>
+          <w:tcPr>
+            <w:tcW w:type="dxa" w:w="2523"/>
+          </w:tcPr>
+          <w:p>
+            <w:r/>
+            <w:r>
+              <w:rPr>
+                <w:sz w:val="18"/>
+              </w:rPr>
+              <w:t>–</w:t>
+            </w:r>
+          </w:p>
+        </w:tc>
+        <w:tc>
+          <w:tcPr>
+            <w:tcW w:type="dxa" w:w="2523"/>
+          </w:tcPr>
+          <w:p>
+            <w:r/>
+            <w:r>
+              <w:rPr>
+                <w:sz w:val="18"/>
+              </w:rPr>
+              <w:t>Admin olmayan kullanıcı ile giriş yap.</w:t>
+            </w:r>
+          </w:p>
+        </w:tc>
+        <w:tc>
+          <w:tcPr>
+            <w:tcW w:type="dxa" w:w="2523"/>
+          </w:tcPr>
+          <w:p>
+            <w:r/>
+            <w:r>
+              <w:rPr>
+                <w:sz w:val="18"/>
+              </w:rPr>
+              <w:t xml:space="preserve">Menüde Denetim Kayıtları görünmez; </w:t>
+            </w:r>
+            <w:r>
+              <w:rPr>
+                <w:rFonts w:ascii="Consolas" w:hAnsi="Consolas"/>
+                <w:sz w:val="18"/>
+              </w:rPr>
+              <w:t>/AuditLog/Index</w:t>
+            </w:r>
+            <w:r>
+              <w:rPr>
+                <w:sz w:val="18"/>
+              </w:rPr>
+              <w:t xml:space="preserve"> adresi doğrudan açılırsa "Erişim Reddedildi" sayfasına yönlenir.</w:t>
+            </w:r>
+          </w:p>
+        </w:tc>
+        <w:tc>
+          <w:tcPr>
+            <w:tcW w:type="dxa" w:w="2523"/>
+          </w:tcPr>
+          <w:p>
+            <w:r/>
+          </w:p>
+        </w:tc>
+        <w:tc>
+          <w:tcPr>
+            <w:tcW w:type="dxa" w:w="2523"/>
+          </w:tcPr>
+          <w:p>
+            <w:r/>
+          </w:p>
+        </w:tc>
+      </w:tr>
+      <w:tr>
+        <w:trPr>
+          <w:cantSplit/>
+        </w:trPr>
+        <w:tc>
+          <w:tcPr>
+            <w:tcW w:type="dxa" w:w="2523"/>
+          </w:tcPr>
+          <w:p>
+            <w:r/>
+            <w:r>
+              <w:rPr>
+                <w:sz w:val="18"/>
+              </w:rPr>
+              <w:t>A-03</w:t>
+            </w:r>
+          </w:p>
+        </w:tc>
+        <w:tc>
+          <w:tcPr>
+            <w:tcW w:type="dxa" w:w="2523"/>
+          </w:tcPr>
+          <w:p>
+            <w:r/>
+            <w:r>
+              <w:rPr>
+                <w:sz w:val="18"/>
+              </w:rPr>
+              <w:t>–</w:t>
+            </w:r>
+          </w:p>
+        </w:tc>
+        <w:tc>
+          <w:tcPr>
+            <w:tcW w:type="dxa" w:w="2523"/>
+          </w:tcPr>
+          <w:p>
+            <w:r/>
+            <w:r>
+              <w:rPr>
+                <w:sz w:val="18"/>
+              </w:rPr>
+              <w:t>Sayfayı filtresiz aç.</w:t>
+            </w:r>
+          </w:p>
+        </w:tc>
+        <w:tc>
+          <w:tcPr>
+            <w:tcW w:type="dxa" w:w="2523"/>
+          </w:tcPr>
+          <w:p>
+            <w:r/>
+            <w:r>
+              <w:rPr>
+                <w:sz w:val="18"/>
+              </w:rPr>
+              <w:t xml:space="preserve">Kayıtlar en yeniden eskiye listelenir; tarihler Türkiye saatinde </w:t>
+            </w:r>
+            <w:r>
+              <w:rPr>
+                <w:rFonts w:ascii="Consolas" w:hAnsi="Consolas"/>
+                <w:sz w:val="18"/>
+              </w:rPr>
+              <w:t>gg.aa.yyyy SS:dd:ss</w:t>
+            </w:r>
+            <w:r>
+              <w:rPr>
+                <w:sz w:val="18"/>
+              </w:rPr>
+              <w:t xml:space="preserve"> formatındadır; toplam sayı görünür.</w:t>
+            </w:r>
+          </w:p>
+        </w:tc>
+        <w:tc>
+          <w:tcPr>
+            <w:tcW w:type="dxa" w:w="2523"/>
+          </w:tcPr>
+          <w:p>
+            <w:r/>
+          </w:p>
+        </w:tc>
+        <w:tc>
+          <w:tcPr>
+            <w:tcW w:type="dxa" w:w="2523"/>
+          </w:tcPr>
+          <w:p>
+            <w:r/>
+          </w:p>
+        </w:tc>
+      </w:tr>
+      <w:tr>
+        <w:trPr>
+          <w:cantSplit/>
+        </w:trPr>
+        <w:tc>
+          <w:tcPr>
+            <w:tcW w:type="dxa" w:w="2523"/>
+          </w:tcPr>
+          <w:p>
+            <w:r/>
+            <w:r>
+              <w:rPr>
+                <w:sz w:val="18"/>
+              </w:rPr>
+              <w:t>A-04</w:t>
+            </w:r>
+          </w:p>
+        </w:tc>
+        <w:tc>
+          <w:tcPr>
+            <w:tcW w:type="dxa" w:w="2523"/>
+          </w:tcPr>
+          <w:p>
+            <w:r/>
+            <w:r>
+              <w:rPr>
+                <w:sz w:val="18"/>
+              </w:rPr>
+              <w:t>–</w:t>
+            </w:r>
+          </w:p>
+        </w:tc>
+        <w:tc>
+          <w:tcPr>
+            <w:tcW w:type="dxa" w:w="2523"/>
+          </w:tcPr>
+          <w:p>
+            <w:r/>
+            <w:r>
+              <w:rPr>
+                <w:b/>
+                <w:sz w:val="18"/>
+              </w:rPr>
+              <w:t>Varlık</w:t>
+            </w:r>
+            <w:r>
+              <w:rPr>
+                <w:sz w:val="18"/>
+              </w:rPr>
+              <w:t xml:space="preserve"> ve </w:t>
+            </w:r>
+            <w:r>
+              <w:rPr>
+                <w:b/>
+                <w:sz w:val="18"/>
+              </w:rPr>
+              <w:t>İşlem</w:t>
+            </w:r>
+            <w:r>
+              <w:rPr>
+                <w:sz w:val="18"/>
+              </w:rPr>
+              <w:t xml:space="preserve"> listelerinden seçim yapıp Filtrele'ye tıkla.</w:t>
+            </w:r>
+          </w:p>
+        </w:tc>
+        <w:tc>
+          <w:tcPr>
+            <w:tcW w:type="dxa" w:w="2523"/>
+          </w:tcPr>
+          <w:p>
+            <w:r/>
+            <w:r>
+              <w:rPr>
+                <w:sz w:val="18"/>
+              </w:rPr>
+              <w:t>Yalnızca seçilen varlık/işlem kayıtları gelir (örn. Varlık: Dolly, İşlem: Modified).</w:t>
+            </w:r>
+          </w:p>
+        </w:tc>
+        <w:tc>
+          <w:tcPr>
+            <w:tcW w:type="dxa" w:w="2523"/>
+          </w:tcPr>
+          <w:p>
+            <w:r/>
+          </w:p>
+        </w:tc>
+        <w:tc>
+          <w:tcPr>
+            <w:tcW w:type="dxa" w:w="2523"/>
+          </w:tcPr>
+          <w:p>
+            <w:r/>
+          </w:p>
+        </w:tc>
+      </w:tr>
+      <w:tr>
+        <w:trPr>
+          <w:cantSplit/>
+        </w:trPr>
+        <w:tc>
+          <w:tcPr>
+            <w:tcW w:type="dxa" w:w="2523"/>
+          </w:tcPr>
+          <w:p>
+            <w:r/>
+            <w:r>
+              <w:rPr>
+                <w:sz w:val="18"/>
+              </w:rPr>
+              <w:t>A-05</w:t>
+            </w:r>
+          </w:p>
+        </w:tc>
+        <w:tc>
+          <w:tcPr>
+            <w:tcW w:type="dxa" w:w="2523"/>
+          </w:tcPr>
+          <w:p>
+            <w:r/>
+            <w:r>
+              <w:rPr>
+                <w:sz w:val="18"/>
+              </w:rPr>
+              <w:t>–</w:t>
+            </w:r>
+          </w:p>
+        </w:tc>
+        <w:tc>
+          <w:tcPr>
+            <w:tcW w:type="dxa" w:w="2523"/>
+          </w:tcPr>
+          <w:p>
+            <w:r/>
+            <w:r>
+              <w:rPr>
+                <w:sz w:val="18"/>
+              </w:rPr>
+              <w:t xml:space="preserve">Başlangıç ve bitiş tarihi seç (takvim </w:t>
+            </w:r>
+            <w:r>
+              <w:rPr>
+                <w:rFonts w:ascii="Consolas" w:hAnsi="Consolas"/>
+                <w:sz w:val="18"/>
+              </w:rPr>
+              <w:t>gg/aa/yyyy</w:t>
+            </w:r>
+            <w:r>
+              <w:rPr>
+                <w:sz w:val="18"/>
+              </w:rPr>
+              <w:t>), Filtrele.</w:t>
+            </w:r>
+          </w:p>
+        </w:tc>
+        <w:tc>
+          <w:tcPr>
+            <w:tcW w:type="dxa" w:w="2523"/>
+          </w:tcPr>
+          <w:p>
+            <w:r/>
+            <w:r>
+              <w:rPr>
+                <w:sz w:val="18"/>
+              </w:rPr>
+              <w:t>Yalnızca seçilen aralıktaki kayıtlar gelir; ilk/son satırın saatini kontrol et.</w:t>
+            </w:r>
+          </w:p>
+        </w:tc>
+        <w:tc>
+          <w:tcPr>
+            <w:tcW w:type="dxa" w:w="2523"/>
+          </w:tcPr>
+          <w:p>
+            <w:r/>
+          </w:p>
+        </w:tc>
+        <w:tc>
+          <w:tcPr>
+            <w:tcW w:type="dxa" w:w="2523"/>
+          </w:tcPr>
+          <w:p>
+            <w:r/>
+          </w:p>
+        </w:tc>
+      </w:tr>
+      <w:tr>
+        <w:trPr>
+          <w:cantSplit/>
+        </w:trPr>
+        <w:tc>
+          <w:tcPr>
+            <w:tcW w:type="dxa" w:w="2523"/>
+          </w:tcPr>
+          <w:p>
+            <w:r/>
+            <w:r>
+              <w:rPr>
+                <w:sz w:val="18"/>
+              </w:rPr>
+              <w:t>A-06</w:t>
+            </w:r>
+          </w:p>
+        </w:tc>
+        <w:tc>
+          <w:tcPr>
+            <w:tcW w:type="dxa" w:w="2523"/>
+          </w:tcPr>
+          <w:p>
+            <w:r/>
+            <w:r>
+              <w:rPr>
+                <w:sz w:val="18"/>
+              </w:rPr>
+              <w:t>–</w:t>
+            </w:r>
+          </w:p>
+        </w:tc>
+        <w:tc>
+          <w:tcPr>
+            <w:tcW w:type="dxa" w:w="2523"/>
+          </w:tcPr>
+          <w:p>
+            <w:r/>
+            <w:r>
+              <w:rPr>
+                <w:sz w:val="18"/>
+              </w:rPr>
+              <w:t>Bir dolly adını düzenle ve kaydet; ardından Varlık: Dolly, İşlem: Modified filtrele.</w:t>
+            </w:r>
+          </w:p>
+        </w:tc>
+        <w:tc>
+          <w:tcPr>
+            <w:tcW w:type="dxa" w:w="2523"/>
+          </w:tcPr>
+          <w:p>
+            <w:r/>
+            <w:r>
+              <w:rPr>
+                <w:sz w:val="18"/>
+              </w:rPr>
+              <w:t xml:space="preserve">Yeni bir kayıt oluşur; </w:t>
+            </w:r>
+            <w:r>
+              <w:rPr>
+                <w:b/>
+                <w:sz w:val="18"/>
+              </w:rPr>
+              <w:t>Değerleri göster</w:t>
+            </w:r>
+            <w:r>
+              <w:rPr>
+                <w:sz w:val="18"/>
+              </w:rPr>
+              <w:t xml:space="preserve"> ile eski ve yeni değer görünür.</w:t>
+            </w:r>
+          </w:p>
+        </w:tc>
+        <w:tc>
+          <w:tcPr>
+            <w:tcW w:type="dxa" w:w="2523"/>
+          </w:tcPr>
+          <w:p>
+            <w:r/>
+          </w:p>
+        </w:tc>
+        <w:tc>
+          <w:tcPr>
+            <w:tcW w:type="dxa" w:w="2523"/>
+          </w:tcPr>
+          <w:p>
+            <w:r/>
+          </w:p>
+        </w:tc>
+      </w:tr>
+      <w:tr>
+        <w:trPr>
+          <w:cantSplit/>
+        </w:trPr>
+        <w:tc>
+          <w:tcPr>
+            <w:tcW w:type="dxa" w:w="2523"/>
+          </w:tcPr>
+          <w:p>
+            <w:r/>
+            <w:r>
+              <w:rPr>
+                <w:sz w:val="18"/>
+              </w:rPr>
+              <w:t>A-07</w:t>
+            </w:r>
+          </w:p>
+        </w:tc>
+        <w:tc>
+          <w:tcPr>
+            <w:tcW w:type="dxa" w:w="2523"/>
+          </w:tcPr>
+          <w:p>
+            <w:r/>
+            <w:r>
+              <w:rPr>
+                <w:sz w:val="18"/>
+              </w:rPr>
+              <w:t>–</w:t>
+            </w:r>
+          </w:p>
+        </w:tc>
+        <w:tc>
+          <w:tcPr>
+            <w:tcW w:type="dxa" w:w="2523"/>
+          </w:tcPr>
+          <w:p>
+            <w:r/>
+            <w:r>
+              <w:rPr>
+                <w:b/>
+                <w:sz w:val="18"/>
+              </w:rPr>
+              <w:t>Değerlerde ara</w:t>
+            </w:r>
+            <w:r>
+              <w:rPr>
+                <w:sz w:val="18"/>
+              </w:rPr>
+              <w:t xml:space="preserve"> alanına bir değer (örn. dolly adı) yaz.</w:t>
+            </w:r>
+          </w:p>
+        </w:tc>
+        <w:tc>
+          <w:tcPr>
+            <w:tcW w:type="dxa" w:w="2523"/>
+          </w:tcPr>
+          <w:p>
+            <w:r/>
+            <w:r>
+              <w:rPr>
+                <w:sz w:val="18"/>
+              </w:rPr>
+              <w:t>Eski/yeni değerlerinde bu metin geçen kayıtlar gelir.</w:t>
+            </w:r>
+          </w:p>
+        </w:tc>
+        <w:tc>
+          <w:tcPr>
+            <w:tcW w:type="dxa" w:w="2523"/>
+          </w:tcPr>
+          <w:p>
+            <w:r/>
+          </w:p>
+        </w:tc>
+        <w:tc>
+          <w:tcPr>
+            <w:tcW w:type="dxa" w:w="2523"/>
+          </w:tcPr>
+          <w:p>
+            <w:r/>
+          </w:p>
+        </w:tc>
+      </w:tr>
+      <w:tr>
+        <w:trPr>
+          <w:cantSplit/>
+        </w:trPr>
+        <w:tc>
+          <w:tcPr>
+            <w:tcW w:type="dxa" w:w="2523"/>
+          </w:tcPr>
+          <w:p>
+            <w:r/>
+            <w:r>
+              <w:rPr>
+                <w:sz w:val="18"/>
+              </w:rPr>
+              <w:t>A-08</w:t>
+            </w:r>
+          </w:p>
+        </w:tc>
+        <w:tc>
+          <w:tcPr>
+            <w:tcW w:type="dxa" w:w="2523"/>
+          </w:tcPr>
+          <w:p>
+            <w:r/>
+            <w:r>
+              <w:rPr>
+                <w:sz w:val="18"/>
+              </w:rPr>
+              <w:t>–</w:t>
+            </w:r>
+          </w:p>
+        </w:tc>
+        <w:tc>
+          <w:tcPr>
+            <w:tcW w:type="dxa" w:w="2523"/>
+          </w:tcPr>
+          <w:p>
+            <w:r/>
+            <w:r>
+              <w:rPr>
+                <w:sz w:val="18"/>
+              </w:rPr>
+              <w:t>Kayıt No veya Kullanıcı alanı ile filtrele.</w:t>
+            </w:r>
+          </w:p>
+        </w:tc>
+        <w:tc>
+          <w:tcPr>
+            <w:tcW w:type="dxa" w:w="2523"/>
+          </w:tcPr>
+          <w:p>
+            <w:r/>
+            <w:r>
+              <w:rPr>
+                <w:sz w:val="18"/>
+              </w:rPr>
+              <w:t xml:space="preserve">Yalnızca eşleşen kayıtlar gelir. </w:t>
+            </w:r>
+            <w:r>
+              <w:rPr>
+                <w:i/>
+                <w:sz w:val="18"/>
+              </w:rPr>
+              <w:t>(Kullanıcı sütunu şu an kayıtlarda boş olabilir; bilinen sınırlama.)</w:t>
+            </w:r>
+          </w:p>
+        </w:tc>
+        <w:tc>
+          <w:tcPr>
+            <w:tcW w:type="dxa" w:w="2523"/>
+          </w:tcPr>
+          <w:p>
+            <w:r/>
+          </w:p>
+        </w:tc>
+        <w:tc>
+          <w:tcPr>
+            <w:tcW w:type="dxa" w:w="2523"/>
+          </w:tcPr>
+          <w:p>
+            <w:r/>
+          </w:p>
+        </w:tc>
+      </w:tr>
+      <w:tr>
+        <w:trPr>
+          <w:cantSplit/>
+        </w:trPr>
+        <w:tc>
+          <w:tcPr>
+            <w:tcW w:type="dxa" w:w="2523"/>
+          </w:tcPr>
+          <w:p>
+            <w:r/>
+            <w:r>
+              <w:rPr>
+                <w:sz w:val="18"/>
+              </w:rPr>
+              <w:t>A-09</w:t>
+            </w:r>
+          </w:p>
+        </w:tc>
+        <w:tc>
+          <w:tcPr>
+            <w:tcW w:type="dxa" w:w="2523"/>
+          </w:tcPr>
+          <w:p>
+            <w:r/>
+            <w:r>
+              <w:rPr>
+                <w:sz w:val="18"/>
+              </w:rPr>
+              <w:t>–</w:t>
+            </w:r>
+          </w:p>
+        </w:tc>
+        <w:tc>
+          <w:tcPr>
+            <w:tcW w:type="dxa" w:w="2523"/>
+          </w:tcPr>
+          <w:p>
+            <w:r/>
+            <w:r>
+              <w:rPr>
+                <w:sz w:val="18"/>
+              </w:rPr>
+              <w:t>Satır sayısını 25 yapıp Sonraki / Önceki ile gez.</w:t>
+            </w:r>
+          </w:p>
+        </w:tc>
+        <w:tc>
+          <w:tcPr>
+            <w:tcW w:type="dxa" w:w="2523"/>
+          </w:tcPr>
+          <w:p>
+            <w:r/>
+            <w:r>
+              <w:rPr>
+                <w:sz w:val="18"/>
+              </w:rPr>
+              <w:t>Sayfalama çalışır, uygulanan filtreler sayfa değişince korunur.</w:t>
+            </w:r>
+          </w:p>
+        </w:tc>
+        <w:tc>
+          <w:tcPr>
+            <w:tcW w:type="dxa" w:w="2523"/>
+          </w:tcPr>
+          <w:p>
+            <w:r/>
+          </w:p>
+        </w:tc>
+        <w:tc>
+          <w:tcPr>
+            <w:tcW w:type="dxa" w:w="2523"/>
+          </w:tcPr>
+          <w:p>
+            <w:r/>
+          </w:p>
+        </w:tc>
+      </w:tr>
+      <w:tr>
+        <w:trPr>
+          <w:cantSplit/>
+        </w:trPr>
+        <w:tc>
+          <w:tcPr>
+            <w:tcW w:type="dxa" w:w="2523"/>
+          </w:tcPr>
+          <w:p>
+            <w:r/>
+            <w:r>
+              <w:rPr>
+                <w:sz w:val="18"/>
+              </w:rPr>
+              <w:t>A-10</w:t>
+            </w:r>
+          </w:p>
+        </w:tc>
+        <w:tc>
+          <w:tcPr>
+            <w:tcW w:type="dxa" w:w="2523"/>
+          </w:tcPr>
+          <w:p>
+            <w:r/>
+            <w:r>
+              <w:rPr>
+                <w:sz w:val="18"/>
+              </w:rPr>
+              <w:t>–</w:t>
+            </w:r>
+          </w:p>
+        </w:tc>
+        <w:tc>
+          <w:tcPr>
+            <w:tcW w:type="dxa" w:w="2523"/>
+          </w:tcPr>
+          <w:p>
+            <w:r/>
+            <w:r>
+              <w:rPr>
+                <w:sz w:val="18"/>
+              </w:rPr>
+              <w:t>Hiç eşleşmeyen bir filtre uygula.</w:t>
+            </w:r>
+          </w:p>
+        </w:tc>
+        <w:tc>
+          <w:tcPr>
+            <w:tcW w:type="dxa" w:w="2523"/>
+          </w:tcPr>
+          <w:p>
+            <w:r/>
+            <w:r>
+              <w:rPr>
+                <w:sz w:val="18"/>
+              </w:rPr>
+              <w:t>"Kayıt bulunamadı." mesajı görünür, hata oluşmaz.</w:t>
+            </w:r>
+          </w:p>
+        </w:tc>
+        <w:tc>
+          <w:tcPr>
+            <w:tcW w:type="dxa" w:w="2523"/>
+          </w:tcPr>
+          <w:p>
+            <w:r/>
+          </w:p>
+        </w:tc>
+        <w:tc>
+          <w:tcPr>
+            <w:tcW w:type="dxa" w:w="2523"/>
+          </w:tcPr>
+          <w:p>
+            <w:r/>
+          </w:p>
+        </w:tc>
+      </w:tr>
+      <w:tr>
+        <w:trPr>
+          <w:cantSplit/>
+        </w:trPr>
+        <w:tc>
+          <w:tcPr>
+            <w:tcW w:type="dxa" w:w="2523"/>
+          </w:tcPr>
+          <w:p>
+            <w:r/>
+            <w:r>
+              <w:rPr>
+                <w:sz w:val="18"/>
+              </w:rPr>
+              <w:t>A-11</w:t>
+            </w:r>
+          </w:p>
+        </w:tc>
+        <w:tc>
+          <w:tcPr>
+            <w:tcW w:type="dxa" w:w="2523"/>
+          </w:tcPr>
+          <w:p>
+            <w:r/>
+            <w:r>
+              <w:rPr>
+                <w:sz w:val="18"/>
+              </w:rPr>
+              <w:t>–</w:t>
+            </w:r>
+          </w:p>
+        </w:tc>
+        <w:tc>
+          <w:tcPr>
+            <w:tcW w:type="dxa" w:w="2523"/>
+          </w:tcPr>
+          <w:p>
+            <w:r/>
+            <w:r>
+              <w:rPr>
+                <w:b/>
+                <w:sz w:val="18"/>
+              </w:rPr>
+              <w:t>Temizle</w:t>
+            </w:r>
+            <w:r>
+              <w:rPr>
+                <w:sz w:val="18"/>
+              </w:rPr>
+              <w:t>'ye tıkla.</w:t>
+            </w:r>
+          </w:p>
+        </w:tc>
+        <w:tc>
+          <w:tcPr>
+            <w:tcW w:type="dxa" w:w="2523"/>
+          </w:tcPr>
+          <w:p>
+            <w:r/>
+            <w:r>
+              <w:rPr>
+                <w:sz w:val="18"/>
+              </w:rPr>
+              <w:t>Filtreler sıfırlanır, tüm kayıtlar listelenir.</w:t>
+            </w:r>
+          </w:p>
+        </w:tc>
+        <w:tc>
+          <w:tcPr>
+            <w:tcW w:type="dxa" w:w="2523"/>
+          </w:tcPr>
+          <w:p>
+            <w:r/>
+          </w:p>
+        </w:tc>
+        <w:tc>
+          <w:tcPr>
+            <w:tcW w:type="dxa" w:w="2523"/>
+          </w:tcPr>
+          <w:p>
+            <w:r/>
+          </w:p>
+        </w:tc>
+      </w:tr>
+    </w:tbl>
+    <w:p/>
+    <w:p>
+      <w:pPr>
+        <w:pStyle w:val="Heading2"/>
+      </w:pPr>
+      <w:r>
+        <w:t>8. Sıcaklık doğruluğu</w:t>
       </w:r>
     </w:p>
     <w:tbl>
@@ -4083,6 +5174,63 @@
                 <w:sz w:val="18"/>
               </w:rPr>
               <w:t>4</w:t>
+            </w:r>
+          </w:p>
+        </w:tc>
+        <w:tc>
+          <w:tcPr>
+            <w:tcW w:type="dxa" w:w="3028"/>
+          </w:tcPr>
+          <w:p>
+            <w:r/>
+          </w:p>
+        </w:tc>
+        <w:tc>
+          <w:tcPr>
+            <w:tcW w:type="dxa" w:w="3028"/>
+          </w:tcPr>
+          <w:p>
+            <w:r/>
+          </w:p>
+        </w:tc>
+        <w:tc>
+          <w:tcPr>
+            <w:tcW w:type="dxa" w:w="3028"/>
+          </w:tcPr>
+          <w:p>
+            <w:r/>
+          </w:p>
+        </w:tc>
+      </w:tr>
+      <w:tr>
+        <w:trPr>
+          <w:cantSplit/>
+        </w:trPr>
+        <w:tc>
+          <w:tcPr>
+            <w:tcW w:type="dxa" w:w="3028"/>
+          </w:tcPr>
+          <w:p>
+            <w:r/>
+            <w:r>
+              <w:rPr>
+                <w:sz w:val="18"/>
+              </w:rPr>
+              <w:t>Denetim Kayıtları</w:t>
+            </w:r>
+          </w:p>
+        </w:tc>
+        <w:tc>
+          <w:tcPr>
+            <w:tcW w:type="dxa" w:w="3028"/>
+          </w:tcPr>
+          <w:p>
+            <w:r/>
+            <w:r>
+              <w:rPr>
+                <w:sz w:val="18"/>
+              </w:rPr>
+              <w:t>11</w:t>
             </w:r>
           </w:p>
         </w:tc>

</xml_diff>

<commit_message>
UAT: denetim kayitlari senaryolari guncellendi (acilista bos liste, islem filtresi, A-12)
Co-Authored-By: Claude Sonnet 5.5 <noreply@anthropic.com>
</commit_message>
<xml_diff>
--- a/docs/UAT.docx
+++ b/docs/UAT.docx
@@ -3496,21 +3496,34 @@
               <w:rPr>
                 <w:sz w:val="18"/>
               </w:rPr>
-              <w:t>Sayfayı filtresiz aç.</w:t>
+              <w:t xml:space="preserve">Menüden sayfayı </w:t>
             </w:r>
-          </w:p>
-        </w:tc>
-        <w:tc>
-          <w:tcPr>
-            <w:tcW w:type="dxa" w:w="2523"/>
-          </w:tcPr>
-          <w:p>
-            <w:r/>
+            <w:r>
+              <w:rPr>
+                <w:b/>
+                <w:sz w:val="18"/>
+              </w:rPr>
+              <w:t>hiçbir filtre seçmeden</w:t>
+            </w:r>
             <w:r>
               <w:rPr>
                 <w:sz w:val="18"/>
               </w:rPr>
-              <w:t xml:space="preserve">Kayıtlar en yeniden eskiye listelenir; tarihler Türkiye saatinde </w:t>
+              <w:t xml:space="preserve"> aç.</w:t>
+            </w:r>
+          </w:p>
+        </w:tc>
+        <w:tc>
+          <w:tcPr>
+            <w:tcW w:type="dxa" w:w="2523"/>
+          </w:tcPr>
+          <w:p>
+            <w:r/>
+            <w:r>
+              <w:rPr>
+                <w:sz w:val="18"/>
+              </w:rPr>
+              <w:t xml:space="preserve">Tablo boş gelmez; kayıtlar en yeniden eskiye listelenir (açılışta gizli bir filtre uygulanmamalı); tarihler Türkiye saatinde </w:t>
             </w:r>
             <w:r>
               <w:rPr>
@@ -3620,7 +3633,7 @@
               <w:rPr>
                 <w:sz w:val="18"/>
               </w:rPr>
-              <w:t>Yalnızca seçilen varlık/işlem kayıtları gelir (örn. Varlık: Dolly, İşlem: Modified).</w:t>
+              <w:t>Yalnızca seçilen varlık/işlem kayıtları gelir (örn. Varlık: Dolly, İşlem: Modified). Seçilen işlem Filtrele sonrası listede seçili kalır.</w:t>
             </w:r>
           </w:p>
         </w:tc>
@@ -4031,7 +4044,7 @@
               <w:rPr>
                 <w:sz w:val="18"/>
               </w:rPr>
-              <w:t>Satır sayısını 25 yapıp Sonraki / Önceki ile gez.</w:t>
+              <w:t>Bir işlem filtresi (örn. Added) seçip satır sayısını 25 yap; Sonraki / Önceki ile gez.</w:t>
             </w:r>
           </w:p>
         </w:tc>
@@ -4045,7 +4058,7 @@
               <w:rPr>
                 <w:sz w:val="18"/>
               </w:rPr>
-              <w:t>Sayfalama çalışır, uygulanan filtreler sayfa değişince korunur.</w:t>
+              <w:t>Sayfalama çalışır, işlem dahil uygulanan tüm filtreler sayfa değişince korunur.</w:t>
             </w:r>
           </w:p>
         </w:tc>
@@ -4207,6 +4220,83 @@
                 <w:sz w:val="18"/>
               </w:rPr>
               <w:t>Filtreler sıfırlanır, tüm kayıtlar listelenir.</w:t>
+            </w:r>
+          </w:p>
+        </w:tc>
+        <w:tc>
+          <w:tcPr>
+            <w:tcW w:type="dxa" w:w="2523"/>
+          </w:tcPr>
+          <w:p>
+            <w:r/>
+          </w:p>
+        </w:tc>
+        <w:tc>
+          <w:tcPr>
+            <w:tcW w:type="dxa" w:w="2523"/>
+          </w:tcPr>
+          <w:p>
+            <w:r/>
+          </w:p>
+        </w:tc>
+      </w:tr>
+      <w:tr>
+        <w:trPr>
+          <w:cantSplit/>
+        </w:trPr>
+        <w:tc>
+          <w:tcPr>
+            <w:tcW w:type="dxa" w:w="2523"/>
+          </w:tcPr>
+          <w:p>
+            <w:r/>
+            <w:r>
+              <w:rPr>
+                <w:sz w:val="18"/>
+              </w:rPr>
+              <w:t>A-12</w:t>
+            </w:r>
+          </w:p>
+        </w:tc>
+        <w:tc>
+          <w:tcPr>
+            <w:tcW w:type="dxa" w:w="2523"/>
+          </w:tcPr>
+          <w:p>
+            <w:r/>
+            <w:r>
+              <w:rPr>
+                <w:sz w:val="18"/>
+              </w:rPr>
+              <w:t>–</w:t>
+            </w:r>
+          </w:p>
+        </w:tc>
+        <w:tc>
+          <w:tcPr>
+            <w:tcW w:type="dxa" w:w="2523"/>
+          </w:tcPr>
+          <w:p>
+            <w:r/>
+            <w:r>
+              <w:rPr>
+                <w:sz w:val="18"/>
+              </w:rPr>
+              <w:t>Cihazdan yeni bir sıcaklık/nem verisi gönder (veya bir dolly ekle) ve sayfayı yenile.</w:t>
+            </w:r>
+          </w:p>
+        </w:tc>
+        <w:tc>
+          <w:tcPr>
+            <w:tcW w:type="dxa" w:w="2523"/>
+          </w:tcPr>
+          <w:p>
+            <w:r/>
+            <w:r>
+              <w:rPr>
+                <w:sz w:val="18"/>
+              </w:rPr>
+              <w:t>Yeni işlem Varlık: Sicaklik / Nem / Dolly, İşlem: Added olarak en üstte görünür; Yeni değer detayında gönderilen değerler yer alır.</w:t>
             </w:r>
           </w:p>
         </w:tc>
@@ -5230,7 +5320,7 @@
               <w:rPr>
                 <w:sz w:val="18"/>
               </w:rPr>
-              <w:t>11</w:t>
+              <w:t>12</w:t>
             </w:r>
           </w:p>
         </w:tc>

</xml_diff>

<commit_message>
Cihaz uzaktan konfigurasyonu: Config API, gonderim ekrani, rapor (v1.1.0)
- API: Config/Get, Config/GetVsControl, Config/DollyLog; DollySettings ve
  DollyConfigEvents tablolari (migration AddDollySettings)
- API: Config/Devices, Default, Publish, Events (dashboard icin)
- Dashboard: Cihaz Konfigurasyonu (cihaz/model secimi, config formu) ve
  Konfigurasyon Raporu (durum kartlari, cihaz durumlari, olay gecmisi)
- Gelistirmede (DevLogin:Enabled) THY SSO atlanir, dev admin girisi otomatik
- Development baglantisi 192.168.0.7 PostgreSQL
- UAT: Cihaz Konfigurasyonu bolumu (K-01..K-17), surum 1.1.0

Co-Authored-By: Claude Sonnet 5.5 <noreply@anthropic.com>
</commit_message>
<xml_diff>
--- a/docs/UAT.docx
+++ b/docs/UAT.docx
@@ -32,7 +32,7 @@
         <w:rPr>
           <w:b/>
         </w:rPr>
-        <w:t>v1.0.1</w:t>
+        <w:t>v1.1.0</w:t>
       </w:r>
     </w:p>
     <w:p>
@@ -4848,6 +4848,1174 @@
         <w:pStyle w:val="Heading2"/>
       </w:pPr>
       <w:r>
+        <w:t>9. Cihaz Konfigürasyonu (uzaktan config)</w:t>
+      </w:r>
+    </w:p>
+    <w:p>
+      <w:r>
+        <w:t>Ön koşul: Admin kullanıcı; SICK TDC cihazı Config/Get çağırabiliyor (API adresi cihazda tanımlı). Admin olmayan bir test kullanıcısı.</w:t>
+      </w:r>
+    </w:p>
+    <w:tbl>
+      <w:tblPr>
+        <w:tblStyle w:val="TableGrid"/>
+        <w:tblW w:type="auto" w:w="0"/>
+        <w:tblLayout w:type="autofit"/>
+        <w:tblLook w:firstColumn="1" w:firstRow="1" w:lastColumn="0" w:lastRow="0" w:noHBand="0" w:noVBand="1" w:val="04A0"/>
+      </w:tblPr>
+      <w:tblGrid>
+        <w:gridCol w:w="2523"/>
+        <w:gridCol w:w="2523"/>
+        <w:gridCol w:w="2523"/>
+        <w:gridCol w:w="2523"/>
+        <w:gridCol w:w="2523"/>
+        <w:gridCol w:w="2523"/>
+      </w:tblGrid>
+      <w:tr>
+        <w:trPr>
+          <w:tblHeader w:val="true"/>
+        </w:trPr>
+        <w:tc>
+          <w:tcPr>
+            <w:tcW w:type="dxa" w:w="2523"/>
+            <w:shd w:val="clear" w:color="auto" w:fill="E8ECF1"/>
+          </w:tcPr>
+          <w:p>
+            <w:r/>
+            <w:r>
+              <w:rPr>
+                <w:b/>
+                <w:sz w:val="18"/>
+              </w:rPr>
+              <w:t>ID</w:t>
+            </w:r>
+          </w:p>
+        </w:tc>
+        <w:tc>
+          <w:tcPr>
+            <w:tcW w:type="dxa" w:w="2523"/>
+            <w:shd w:val="clear" w:color="auto" w:fill="E8ECF1"/>
+          </w:tcPr>
+          <w:p>
+            <w:r/>
+            <w:r>
+              <w:rPr>
+                <w:b/>
+                <w:sz w:val="18"/>
+              </w:rPr>
+              <w:t>Issue</w:t>
+            </w:r>
+          </w:p>
+        </w:tc>
+        <w:tc>
+          <w:tcPr>
+            <w:tcW w:type="dxa" w:w="2523"/>
+            <w:shd w:val="clear" w:color="auto" w:fill="E8ECF1"/>
+          </w:tcPr>
+          <w:p>
+            <w:r/>
+            <w:r>
+              <w:rPr>
+                <w:b/>
+                <w:sz w:val="18"/>
+              </w:rPr>
+              <w:t>Adımlar</w:t>
+            </w:r>
+          </w:p>
+        </w:tc>
+        <w:tc>
+          <w:tcPr>
+            <w:tcW w:type="dxa" w:w="2523"/>
+            <w:shd w:val="clear" w:color="auto" w:fill="E8ECF1"/>
+          </w:tcPr>
+          <w:p>
+            <w:r/>
+            <w:r>
+              <w:rPr>
+                <w:b/>
+                <w:sz w:val="18"/>
+              </w:rPr>
+              <w:t>Beklenen sonuç</w:t>
+            </w:r>
+          </w:p>
+        </w:tc>
+        <w:tc>
+          <w:tcPr>
+            <w:tcW w:type="dxa" w:w="2523"/>
+            <w:shd w:val="clear" w:color="auto" w:fill="E8ECF1"/>
+          </w:tcPr>
+          <w:p>
+            <w:r/>
+            <w:r>
+              <w:rPr>
+                <w:b/>
+                <w:sz w:val="18"/>
+              </w:rPr>
+              <w:t>Sonuç</w:t>
+            </w:r>
+          </w:p>
+        </w:tc>
+        <w:tc>
+          <w:tcPr>
+            <w:tcW w:type="dxa" w:w="2523"/>
+            <w:shd w:val="clear" w:color="auto" w:fill="E8ECF1"/>
+          </w:tcPr>
+          <w:p>
+            <w:r/>
+            <w:r>
+              <w:rPr>
+                <w:b/>
+                <w:sz w:val="18"/>
+              </w:rPr>
+              <w:t>Not</w:t>
+            </w:r>
+          </w:p>
+        </w:tc>
+      </w:tr>
+      <w:tr>
+        <w:trPr>
+          <w:cantSplit/>
+        </w:trPr>
+        <w:tc>
+          <w:tcPr>
+            <w:tcW w:type="dxa" w:w="2523"/>
+          </w:tcPr>
+          <w:p>
+            <w:r>
+              <w:t>K-01</w:t>
+            </w:r>
+          </w:p>
+        </w:tc>
+        <w:tc>
+          <w:tcPr>
+            <w:tcW w:type="dxa" w:w="2523"/>
+          </w:tcPr>
+          <w:p>
+            <w:r>
+              <w:t>–</w:t>
+            </w:r>
+          </w:p>
+        </w:tc>
+        <w:tc>
+          <w:tcPr>
+            <w:tcW w:type="dxa" w:w="2523"/>
+          </w:tcPr>
+          <w:p>
+            <w:r>
+              <w:t>Admin ile giriş yap, menüye bak.</w:t>
+            </w:r>
+          </w:p>
+        </w:tc>
+        <w:tc>
+          <w:tcPr>
+            <w:tcW w:type="dxa" w:w="2523"/>
+          </w:tcPr>
+          <w:p>
+            <w:r>
+              <w:t>Cihaz Konfigürasyonu ve Konfigürasyon Raporu menü öğeleri görünür. Admin olmayan kullanıcıda görünmez; adresler doğrudan açılırsa "Erişim Reddedildi" sayfasına yönlenir.</w:t>
+            </w:r>
+          </w:p>
+        </w:tc>
+        <w:tc>
+          <w:tcPr>
+            <w:tcW w:type="dxa" w:w="2523"/>
+          </w:tcPr>
+          <w:p>
+            <w:r/>
+          </w:p>
+        </w:tc>
+        <w:tc>
+          <w:tcPr>
+            <w:tcW w:type="dxa" w:w="2523"/>
+          </w:tcPr>
+          <w:p>
+            <w:r/>
+          </w:p>
+        </w:tc>
+      </w:tr>
+      <w:tr>
+        <w:trPr>
+          <w:cantSplit/>
+        </w:trPr>
+        <w:tc>
+          <w:tcPr>
+            <w:tcW w:type="dxa" w:w="2523"/>
+          </w:tcPr>
+          <w:p>
+            <w:r>
+              <w:t>K-02</w:t>
+            </w:r>
+          </w:p>
+        </w:tc>
+        <w:tc>
+          <w:tcPr>
+            <w:tcW w:type="dxa" w:w="2523"/>
+          </w:tcPr>
+          <w:p>
+            <w:r>
+              <w:t>–</w:t>
+            </w:r>
+          </w:p>
+        </w:tc>
+        <w:tc>
+          <w:tcPr>
+            <w:tcW w:type="dxa" w:w="2523"/>
+          </w:tcPr>
+          <w:p>
+            <w:r>
+              <w:t>Cihaz Konfigürasyonu sayfasını aç.</w:t>
+            </w:r>
+          </w:p>
+        </w:tc>
+        <w:tc>
+          <w:tcPr>
+            <w:tcW w:type="dxa" w:w="2523"/>
+          </w:tcPr>
+          <w:p>
+            <w:r>
+              <w:t>Tüm dolly'ler tabloda listelenir (ad, seri no, model, uygulama sürümü, sunucu/uygulanan cfg, durum). Form varsayılan değerlerle (300/1/60/10/60 sn, 3 kanal, 4 endpoint) dolu gelir.</w:t>
+            </w:r>
+          </w:p>
+        </w:tc>
+        <w:tc>
+          <w:tcPr>
+            <w:tcW w:type="dxa" w:w="2523"/>
+          </w:tcPr>
+          <w:p>
+            <w:r/>
+          </w:p>
+        </w:tc>
+        <w:tc>
+          <w:tcPr>
+            <w:tcW w:type="dxa" w:w="2523"/>
+          </w:tcPr>
+          <w:p>
+            <w:r/>
+          </w:p>
+        </w:tc>
+      </w:tr>
+      <w:tr>
+        <w:trPr>
+          <w:cantSplit/>
+        </w:trPr>
+        <w:tc>
+          <w:tcPr>
+            <w:tcW w:type="dxa" w:w="2523"/>
+          </w:tcPr>
+          <w:p>
+            <w:r>
+              <w:t>K-03</w:t>
+            </w:r>
+          </w:p>
+        </w:tc>
+        <w:tc>
+          <w:tcPr>
+            <w:tcW w:type="dxa" w:w="2523"/>
+          </w:tcPr>
+          <w:p>
+            <w:r>
+              <w:t>–</w:t>
+            </w:r>
+          </w:p>
+        </w:tc>
+        <w:tc>
+          <w:tcPr>
+            <w:tcW w:type="dxa" w:w="2523"/>
+          </w:tcPr>
+          <w:p>
+            <w:r>
+              <w:t>Cihazı hiç seçmeden Seçili cihazlara gönder'e tıkla.</w:t>
+            </w:r>
+          </w:p>
+        </w:tc>
+        <w:tc>
+          <w:tcPr>
+            <w:tcW w:type="dxa" w:w="2523"/>
+          </w:tcPr>
+          <w:p>
+            <w:r>
+              <w:t>"En az bir cihaz seçmelisiniz" uyarısı çıkar, istek gitmez.</w:t>
+            </w:r>
+          </w:p>
+        </w:tc>
+        <w:tc>
+          <w:tcPr>
+            <w:tcW w:type="dxa" w:w="2523"/>
+          </w:tcPr>
+          <w:p>
+            <w:r/>
+          </w:p>
+        </w:tc>
+        <w:tc>
+          <w:tcPr>
+            <w:tcW w:type="dxa" w:w="2523"/>
+          </w:tcPr>
+          <w:p>
+            <w:r/>
+          </w:p>
+        </w:tc>
+      </w:tr>
+      <w:tr>
+        <w:trPr>
+          <w:cantSplit/>
+        </w:trPr>
+        <w:tc>
+          <w:tcPr>
+            <w:tcW w:type="dxa" w:w="2523"/>
+          </w:tcPr>
+          <w:p>
+            <w:r>
+              <w:t>K-04</w:t>
+            </w:r>
+          </w:p>
+        </w:tc>
+        <w:tc>
+          <w:tcPr>
+            <w:tcW w:type="dxa" w:w="2523"/>
+          </w:tcPr>
+          <w:p>
+            <w:r>
+              <w:t>–</w:t>
+            </w:r>
+          </w:p>
+        </w:tc>
+        <w:tc>
+          <w:tcPr>
+            <w:tcW w:type="dxa" w:w="2523"/>
+          </w:tcPr>
+          <w:p>
+            <w:r>
+              <w:t>Tümünü seç / Temizle ve arama kutusunu dene.</w:t>
+            </w:r>
+          </w:p>
+        </w:tc>
+        <w:tc>
+          <w:tcPr>
+            <w:tcW w:type="dxa" w:w="2523"/>
+          </w:tcPr>
+          <w:p>
+            <w:r>
+              <w:t>Seçili sayısı doğru güncellenir; arama yalnızca görünen satırları etkiler.</w:t>
+            </w:r>
+          </w:p>
+        </w:tc>
+        <w:tc>
+          <w:tcPr>
+            <w:tcW w:type="dxa" w:w="2523"/>
+          </w:tcPr>
+          <w:p>
+            <w:r/>
+          </w:p>
+        </w:tc>
+        <w:tc>
+          <w:tcPr>
+            <w:tcW w:type="dxa" w:w="2523"/>
+          </w:tcPr>
+          <w:p>
+            <w:r/>
+          </w:p>
+        </w:tc>
+      </w:tr>
+      <w:tr>
+        <w:trPr>
+          <w:cantSplit/>
+        </w:trPr>
+        <w:tc>
+          <w:tcPr>
+            <w:tcW w:type="dxa" w:w="2523"/>
+          </w:tcPr>
+          <w:p>
+            <w:r>
+              <w:t>K-05</w:t>
+            </w:r>
+          </w:p>
+        </w:tc>
+        <w:tc>
+          <w:tcPr>
+            <w:tcW w:type="dxa" w:w="2523"/>
+          </w:tcPr>
+          <w:p>
+            <w:r>
+              <w:t>–</w:t>
+            </w:r>
+          </w:p>
+        </w:tc>
+        <w:tc>
+          <w:tcPr>
+            <w:tcW w:type="dxa" w:w="2523"/>
+          </w:tcPr>
+          <w:p>
+            <w:r>
+              <w:t>Cihazı (SICK) açıp Config/Get'i çağırmasını bekle (configVersion 0 ile).</w:t>
+            </w:r>
+          </w:p>
+        </w:tc>
+        <w:tc>
+          <w:tcPr>
+            <w:tcW w:type="dxa" w:w="2523"/>
+          </w:tcPr>
+          <w:p>
+            <w:r>
+              <w:t>Cihaz kaydı oluşur: model ve uygulama sürümü sayfada görünür; cihaz varsayılan config'i sürüm 1 ile alır.</w:t>
+            </w:r>
+          </w:p>
+        </w:tc>
+        <w:tc>
+          <w:tcPr>
+            <w:tcW w:type="dxa" w:w="2523"/>
+          </w:tcPr>
+          <w:p>
+            <w:r/>
+          </w:p>
+        </w:tc>
+        <w:tc>
+          <w:tcPr>
+            <w:tcW w:type="dxa" w:w="2523"/>
+          </w:tcPr>
+          <w:p>
+            <w:r/>
+          </w:p>
+        </w:tc>
+      </w:tr>
+      <w:tr>
+        <w:trPr>
+          <w:cantSplit/>
+        </w:trPr>
+        <w:tc>
+          <w:tcPr>
+            <w:tcW w:type="dxa" w:w="2523"/>
+          </w:tcPr>
+          <w:p>
+            <w:r>
+              <w:t>K-06</w:t>
+            </w:r>
+          </w:p>
+        </w:tc>
+        <w:tc>
+          <w:tcPr>
+            <w:tcW w:type="dxa" w:w="2523"/>
+          </w:tcPr>
+          <w:p>
+            <w:r>
+              <w:t>–</w:t>
+            </w:r>
+          </w:p>
+        </w:tc>
+        <w:tc>
+          <w:tcPr>
+            <w:tcW w:type="dxa" w:w="2523"/>
+          </w:tcPr>
+          <w:p>
+            <w:r>
+              <w:t>Modeli seç ile bir cihaz modeli seç; sayıyı kontrol et.</w:t>
+            </w:r>
+          </w:p>
+        </w:tc>
+        <w:tc>
+          <w:tcPr>
+            <w:tcW w:type="dxa" w:w="2523"/>
+          </w:tcPr>
+          <w:p>
+            <w:r>
+              <w:t>Yalnızca o modeldeki cihazlar işaretlenir.</w:t>
+            </w:r>
+          </w:p>
+        </w:tc>
+        <w:tc>
+          <w:tcPr>
+            <w:tcW w:type="dxa" w:w="2523"/>
+          </w:tcPr>
+          <w:p>
+            <w:r/>
+          </w:p>
+        </w:tc>
+        <w:tc>
+          <w:tcPr>
+            <w:tcW w:type="dxa" w:w="2523"/>
+          </w:tcPr>
+          <w:p>
+            <w:r/>
+          </w:p>
+        </w:tc>
+      </w:tr>
+      <w:tr>
+        <w:trPr>
+          <w:cantSplit/>
+        </w:trPr>
+        <w:tc>
+          <w:tcPr>
+            <w:tcW w:type="dxa" w:w="2523"/>
+          </w:tcPr>
+          <w:p>
+            <w:r>
+              <w:t>K-07</w:t>
+            </w:r>
+          </w:p>
+        </w:tc>
+        <w:tc>
+          <w:tcPr>
+            <w:tcW w:type="dxa" w:w="2523"/>
+          </w:tcPr>
+          <w:p>
+            <w:r>
+              <w:t>–</w:t>
+            </w:r>
+          </w:p>
+        </w:tc>
+        <w:tc>
+          <w:tcPr>
+            <w:tcW w:type="dxa" w:w="2523"/>
+          </w:tcPr>
+          <w:p>
+            <w:r>
+              <w:t>Bir cihazı tek tek işaretle, bir değeri değiştir (örn. gönderim aralığı 30), not yaz ve gönder; onay penceresinde Tamam.</w:t>
+            </w:r>
+          </w:p>
+        </w:tc>
+        <w:tc>
+          <w:tcPr>
+            <w:tcW w:type="dxa" w:w="2523"/>
+          </w:tcPr>
+          <w:p>
+            <w:r>
+              <w:t>"Konfigürasyon N cihaz için yayınlandı" mesajı çıkar. Cihazın sunucu cfg sürümü 1 artar, durumu Bekliyor olur.</w:t>
+            </w:r>
+          </w:p>
+        </w:tc>
+        <w:tc>
+          <w:tcPr>
+            <w:tcW w:type="dxa" w:w="2523"/>
+          </w:tcPr>
+          <w:p>
+            <w:r/>
+          </w:p>
+        </w:tc>
+        <w:tc>
+          <w:tcPr>
+            <w:tcW w:type="dxa" w:w="2523"/>
+          </w:tcPr>
+          <w:p>
+            <w:r/>
+          </w:p>
+        </w:tc>
+      </w:tr>
+      <w:tr>
+        <w:trPr>
+          <w:cantSplit/>
+        </w:trPr>
+        <w:tc>
+          <w:tcPr>
+            <w:tcW w:type="dxa" w:w="2523"/>
+          </w:tcPr>
+          <w:p>
+            <w:r>
+              <w:t>K-08</w:t>
+            </w:r>
+          </w:p>
+        </w:tc>
+        <w:tc>
+          <w:tcPr>
+            <w:tcW w:type="dxa" w:w="2523"/>
+          </w:tcPr>
+          <w:p>
+            <w:r>
+              <w:t>–</w:t>
+            </w:r>
+          </w:p>
+        </w:tc>
+        <w:tc>
+          <w:tcPr>
+            <w:tcW w:type="dxa" w:w="2523"/>
+          </w:tcPr>
+          <w:p>
+            <w:r>
+              <w:t>Geçersiz değer ver (süre 0, endpoint / ile başlamıyor).</w:t>
+            </w:r>
+          </w:p>
+        </w:tc>
+        <w:tc>
+          <w:tcPr>
+            <w:tcW w:type="dxa" w:w="2523"/>
+          </w:tcPr>
+          <w:p>
+            <w:r>
+              <w:t>Form gönderilmez veya "yayınlanamadı" uyarısı çıkar; sürüm artmaz.</w:t>
+            </w:r>
+          </w:p>
+        </w:tc>
+        <w:tc>
+          <w:tcPr>
+            <w:tcW w:type="dxa" w:w="2523"/>
+          </w:tcPr>
+          <w:p>
+            <w:r/>
+          </w:p>
+        </w:tc>
+        <w:tc>
+          <w:tcPr>
+            <w:tcW w:type="dxa" w:w="2523"/>
+          </w:tcPr>
+          <w:p>
+            <w:r/>
+          </w:p>
+        </w:tc>
+      </w:tr>
+      <w:tr>
+        <w:trPr>
+          <w:cantSplit/>
+        </w:trPr>
+        <w:tc>
+          <w:tcPr>
+            <w:tcW w:type="dxa" w:w="2523"/>
+          </w:tcPr>
+          <w:p>
+            <w:r>
+              <w:t>K-09</w:t>
+            </w:r>
+          </w:p>
+        </w:tc>
+        <w:tc>
+          <w:tcPr>
+            <w:tcW w:type="dxa" w:w="2523"/>
+          </w:tcPr>
+          <w:p>
+            <w:r>
+              <w:t>–</w:t>
+            </w:r>
+          </w:p>
+        </w:tc>
+        <w:tc>
+          <w:tcPr>
+            <w:tcW w:type="dxa" w:w="2523"/>
+          </w:tcPr>
+          <w:p>
+            <w:r>
+              <w:t>Analog kanal ekle, birini sil, gönder.</w:t>
+            </w:r>
+          </w:p>
+        </w:tc>
+        <w:tc>
+          <w:tcPr>
+            <w:tcW w:type="dxa" w:w="2523"/>
+          </w:tcPr>
+          <w:p>
+            <w:r>
+              <w:t>Cihaza giden config'te kanal listesi ekranla aynıdır (sıra ve alanlar doğru).</w:t>
+            </w:r>
+          </w:p>
+        </w:tc>
+        <w:tc>
+          <w:tcPr>
+            <w:tcW w:type="dxa" w:w="2523"/>
+          </w:tcPr>
+          <w:p>
+            <w:r/>
+          </w:p>
+        </w:tc>
+        <w:tc>
+          <w:tcPr>
+            <w:tcW w:type="dxa" w:w="2523"/>
+          </w:tcPr>
+          <w:p>
+            <w:r/>
+          </w:p>
+        </w:tc>
+      </w:tr>
+      <w:tr>
+        <w:trPr>
+          <w:cantSplit/>
+        </w:trPr>
+        <w:tc>
+          <w:tcPr>
+            <w:tcW w:type="dxa" w:w="2523"/>
+          </w:tcPr>
+          <w:p>
+            <w:r>
+              <w:t>K-10</w:t>
+            </w:r>
+          </w:p>
+        </w:tc>
+        <w:tc>
+          <w:tcPr>
+            <w:tcW w:type="dxa" w:w="2523"/>
+          </w:tcPr>
+          <w:p>
+            <w:r>
+              <w:t>–</w:t>
+            </w:r>
+          </w:p>
+        </w:tc>
+        <w:tc>
+          <w:tcPr>
+            <w:tcW w:type="dxa" w:w="2523"/>
+          </w:tcPr>
+          <w:p>
+            <w:r>
+              <w:t>Cihazın gece saatinde Config/Get'i çağırmasını bekle (veya elle çağır).</w:t>
+            </w:r>
+          </w:p>
+        </w:tc>
+        <w:tc>
+          <w:tcPr>
+            <w:tcW w:type="dxa" w:w="2523"/>
+          </w:tcPr>
+          <w:p>
+            <w:r>
+              <w:t>Yeni config yanıtta gelir ("Konfigürasyon gönderildi"); Rapor'da olay Çekildi görünür. Cihaz uygulayıp yeniden başlar.</w:t>
+            </w:r>
+          </w:p>
+        </w:tc>
+        <w:tc>
+          <w:tcPr>
+            <w:tcW w:type="dxa" w:w="2523"/>
+          </w:tcPr>
+          <w:p>
+            <w:r/>
+          </w:p>
+        </w:tc>
+        <w:tc>
+          <w:tcPr>
+            <w:tcW w:type="dxa" w:w="2523"/>
+          </w:tcPr>
+          <w:p>
+            <w:r/>
+          </w:p>
+        </w:tc>
+      </w:tr>
+      <w:tr>
+        <w:trPr>
+          <w:cantSplit/>
+        </w:trPr>
+        <w:tc>
+          <w:tcPr>
+            <w:tcW w:type="dxa" w:w="2523"/>
+          </w:tcPr>
+          <w:p>
+            <w:r>
+              <w:t>K-11</w:t>
+            </w:r>
+          </w:p>
+        </w:tc>
+        <w:tc>
+          <w:tcPr>
+            <w:tcW w:type="dxa" w:w="2523"/>
+          </w:tcPr>
+          <w:p>
+            <w:r>
+              <w:t>–</w:t>
+            </w:r>
+          </w:p>
+        </w:tc>
+        <w:tc>
+          <w:tcPr>
+            <w:tcW w:type="dxa" w:w="2523"/>
+          </w:tcPr>
+          <w:p>
+            <w:r>
+              <w:t>Cihaz yeniden başlayıp Config/GetVsControl ile bildirimde bulunsun.</w:t>
+            </w:r>
+          </w:p>
+        </w:tc>
+        <w:tc>
+          <w:tcPr>
+            <w:tcW w:type="dxa" w:w="2523"/>
+          </w:tcPr>
+          <w:p>
+            <w:r>
+              <w:t>Rapor'da cihaz durumu Uygulandı, uygulanan cfg = sunucu cfg; olay Uygulandı zaman damgasıyla görünür.</w:t>
+            </w:r>
+          </w:p>
+        </w:tc>
+        <w:tc>
+          <w:tcPr>
+            <w:tcW w:type="dxa" w:w="2523"/>
+          </w:tcPr>
+          <w:p>
+            <w:r/>
+          </w:p>
+        </w:tc>
+        <w:tc>
+          <w:tcPr>
+            <w:tcW w:type="dxa" w:w="2523"/>
+          </w:tcPr>
+          <w:p>
+            <w:r/>
+          </w:p>
+        </w:tc>
+      </w:tr>
+      <w:tr>
+        <w:trPr>
+          <w:cantSplit/>
+        </w:trPr>
+        <w:tc>
+          <w:tcPr>
+            <w:tcW w:type="dxa" w:w="2523"/>
+          </w:tcPr>
+          <w:p>
+            <w:r>
+              <w:t>K-12</w:t>
+            </w:r>
+          </w:p>
+        </w:tc>
+        <w:tc>
+          <w:tcPr>
+            <w:tcW w:type="dxa" w:w="2523"/>
+          </w:tcPr>
+          <w:p>
+            <w:r>
+              <w:t>–</w:t>
+            </w:r>
+          </w:p>
+        </w:tc>
+        <w:tc>
+          <w:tcPr>
+            <w:tcW w:type="dxa" w:w="2523"/>
+          </w:tcPr>
+          <w:p>
+            <w:r>
+              <w:t>Aynı sürümle Config/Get'i tekrar çağır.</w:t>
+            </w:r>
+          </w:p>
+        </w:tc>
+        <w:tc>
+          <w:tcPr>
+            <w:tcW w:type="dxa" w:w="2523"/>
+          </w:tcPr>
+          <w:p>
+            <w:r>
+              <w:t>Yanıt "Değişiklik yok", config: null. Rapor'a yeni "Çekildi" olayı eklenmez.</w:t>
+            </w:r>
+          </w:p>
+        </w:tc>
+        <w:tc>
+          <w:tcPr>
+            <w:tcW w:type="dxa" w:w="2523"/>
+          </w:tcPr>
+          <w:p>
+            <w:r/>
+          </w:p>
+        </w:tc>
+        <w:tc>
+          <w:tcPr>
+            <w:tcW w:type="dxa" w:w="2523"/>
+          </w:tcPr>
+          <w:p>
+            <w:r/>
+          </w:p>
+        </w:tc>
+      </w:tr>
+      <w:tr>
+        <w:trPr>
+          <w:cantSplit/>
+        </w:trPr>
+        <w:tc>
+          <w:tcPr>
+            <w:tcW w:type="dxa" w:w="2523"/>
+          </w:tcPr>
+          <w:p>
+            <w:r>
+              <w:t>K-13</w:t>
+            </w:r>
+          </w:p>
+        </w:tc>
+        <w:tc>
+          <w:tcPr>
+            <w:tcW w:type="dxa" w:w="2523"/>
+          </w:tcPr>
+          <w:p>
+            <w:r>
+              <w:t>–</w:t>
+            </w:r>
+          </w:p>
+        </w:tc>
+        <w:tc>
+          <w:tcPr>
+            <w:tcW w:type="dxa" w:w="2523"/>
+          </w:tcPr>
+          <w:p>
+            <w:r>
+              <w:t>Cihazdan GetVsControl'ü success=false&amp;errorMessage=... ile çağır.</w:t>
+            </w:r>
+          </w:p>
+        </w:tc>
+        <w:tc>
+          <w:tcPr>
+            <w:tcW w:type="dxa" w:w="2523"/>
+          </w:tcPr>
+          <w:p>
+            <w:r>
+              <w:t>Rapor'da cihaz Hata durumunda, hata metni ve zamanı görünür; hatalı cihazlar tabloda en üstte. Yeni config yayınlanınca hata temizlenir.</w:t>
+            </w:r>
+          </w:p>
+        </w:tc>
+        <w:tc>
+          <w:tcPr>
+            <w:tcW w:type="dxa" w:w="2523"/>
+          </w:tcPr>
+          <w:p>
+            <w:r/>
+          </w:p>
+        </w:tc>
+        <w:tc>
+          <w:tcPr>
+            <w:tcW w:type="dxa" w:w="2523"/>
+          </w:tcPr>
+          <w:p>
+            <w:r/>
+          </w:p>
+        </w:tc>
+      </w:tr>
+      <w:tr>
+        <w:trPr>
+          <w:cantSplit/>
+        </w:trPr>
+        <w:tc>
+          <w:tcPr>
+            <w:tcW w:type="dxa" w:w="2523"/>
+          </w:tcPr>
+          <w:p>
+            <w:r>
+              <w:t>K-14</w:t>
+            </w:r>
+          </w:p>
+        </w:tc>
+        <w:tc>
+          <w:tcPr>
+            <w:tcW w:type="dxa" w:w="2523"/>
+          </w:tcPr>
+          <w:p>
+            <w:r>
+              <w:t>–</w:t>
+            </w:r>
+          </w:p>
+        </w:tc>
+        <w:tc>
+          <w:tcPr>
+            <w:tcW w:type="dxa" w:w="2523"/>
+          </w:tcPr>
+          <w:p>
+            <w:r>
+              <w:t>Rapor'da cihaz / olay türü / tarih filtreleri ile satır sayısını dene, sayfalarda gez.</w:t>
+            </w:r>
+          </w:p>
+        </w:tc>
+        <w:tc>
+          <w:tcPr>
+            <w:tcW w:type="dxa" w:w="2523"/>
+          </w:tcPr>
+          <w:p>
+            <w:r>
+              <w:t>Yalnızca eşleşen olaylar gelir; filtreler sayfa değişince korunur; Temizle sıfırlar. Tarihler Türkiye saatindedir.</w:t>
+            </w:r>
+          </w:p>
+        </w:tc>
+        <w:tc>
+          <w:tcPr>
+            <w:tcW w:type="dxa" w:w="2523"/>
+          </w:tcPr>
+          <w:p>
+            <w:r/>
+          </w:p>
+        </w:tc>
+        <w:tc>
+          <w:tcPr>
+            <w:tcW w:type="dxa" w:w="2523"/>
+          </w:tcPr>
+          <w:p>
+            <w:r/>
+          </w:p>
+        </w:tc>
+      </w:tr>
+      <w:tr>
+        <w:trPr>
+          <w:cantSplit/>
+        </w:trPr>
+        <w:tc>
+          <w:tcPr>
+            <w:tcW w:type="dxa" w:w="2523"/>
+          </w:tcPr>
+          <w:p>
+            <w:r>
+              <w:t>K-15</w:t>
+            </w:r>
+          </w:p>
+        </w:tc>
+        <w:tc>
+          <w:tcPr>
+            <w:tcW w:type="dxa" w:w="2523"/>
+          </w:tcPr>
+          <w:p>
+            <w:r>
+              <w:t>–</w:t>
+            </w:r>
+          </w:p>
+        </w:tc>
+        <w:tc>
+          <w:tcPr>
+            <w:tcW w:type="dxa" w:w="2523"/>
+          </w:tcPr>
+          <w:p>
+            <w:r>
+              <w:t>Var olmayan seri no ile Config/Get çağır; serialNumber göndermeden de dene.</w:t>
+            </w:r>
+          </w:p>
+        </w:tc>
+        <w:tc>
+          <w:tcPr>
+            <w:tcW w:type="dxa" w:w="2523"/>
+          </w:tcPr>
+          <w:p>
+            <w:r>
+              <w:t>Var olmayan seri no için 404, eksik alan için 400 döner.</w:t>
+            </w:r>
+          </w:p>
+        </w:tc>
+        <w:tc>
+          <w:tcPr>
+            <w:tcW w:type="dxa" w:w="2523"/>
+          </w:tcPr>
+          <w:p>
+            <w:r/>
+          </w:p>
+        </w:tc>
+        <w:tc>
+          <w:tcPr>
+            <w:tcW w:type="dxa" w:w="2523"/>
+          </w:tcPr>
+          <w:p>
+            <w:r/>
+          </w:p>
+        </w:tc>
+      </w:tr>
+      <w:tr>
+        <w:trPr>
+          <w:cantSplit/>
+        </w:trPr>
+        <w:tc>
+          <w:tcPr>
+            <w:tcW w:type="dxa" w:w="2523"/>
+          </w:tcPr>
+          <w:p>
+            <w:r>
+              <w:t>K-16</w:t>
+            </w:r>
+          </w:p>
+        </w:tc>
+        <w:tc>
+          <w:tcPr>
+            <w:tcW w:type="dxa" w:w="2523"/>
+          </w:tcPr>
+          <w:p>
+            <w:r>
+              <w:t>–</w:t>
+            </w:r>
+          </w:p>
+        </w:tc>
+        <w:tc>
+          <w:tcPr>
+            <w:tcW w:type="dxa" w:w="2523"/>
+          </w:tcPr>
+          <w:p>
+            <w:r>
+              <w:t>Config/DollyLog ile multipart log dosyası yükle.</w:t>
+            </w:r>
+          </w:p>
+        </w:tc>
+        <w:tc>
+          <w:tcPr>
+            <w:tcW w:type="dxa" w:w="2523"/>
+          </w:tcPr>
+          <w:p>
+            <w:r>
+              <w:t>Başarılı yanıt döner; dosya sunucuda Logs/DollyLogs/{seriNo}/ altına kaydedilir; Rapor'da Log yüklendi olayı görünür.</w:t>
+            </w:r>
+          </w:p>
+        </w:tc>
+        <w:tc>
+          <w:tcPr>
+            <w:tcW w:type="dxa" w:w="2523"/>
+          </w:tcPr>
+          <w:p>
+            <w:r/>
+          </w:p>
+        </w:tc>
+        <w:tc>
+          <w:tcPr>
+            <w:tcW w:type="dxa" w:w="2523"/>
+          </w:tcPr>
+          <w:p>
+            <w:r/>
+          </w:p>
+        </w:tc>
+      </w:tr>
+      <w:tr>
+        <w:trPr>
+          <w:cantSplit/>
+        </w:trPr>
+        <w:tc>
+          <w:tcPr>
+            <w:tcW w:type="dxa" w:w="2523"/>
+          </w:tcPr>
+          <w:p>
+            <w:r>
+              <w:t>K-17</w:t>
+            </w:r>
+          </w:p>
+        </w:tc>
+        <w:tc>
+          <w:tcPr>
+            <w:tcW w:type="dxa" w:w="2523"/>
+          </w:tcPr>
+          <w:p>
+            <w:r>
+              <w:t>–</w:t>
+            </w:r>
+          </w:p>
+        </w:tc>
+        <w:tc>
+          <w:tcPr>
+            <w:tcW w:type="dxa" w:w="2523"/>
+          </w:tcPr>
+          <w:p>
+            <w:r>
+              <w:t>Config yayını yapıp Denetim Kayıtları'na bak.</w:t>
+            </w:r>
+          </w:p>
+        </w:tc>
+        <w:tc>
+          <w:tcPr>
+            <w:tcW w:type="dxa" w:w="2523"/>
+          </w:tcPr>
+          <w:p>
+            <w:r>
+              <w:t>Cihaz telemetri güncellemeleri (son görülme vb.) denetim kayıtlarını doldurmaz.</w:t>
+            </w:r>
+          </w:p>
+        </w:tc>
+        <w:tc>
+          <w:tcPr>
+            <w:tcW w:type="dxa" w:w="2523"/>
+          </w:tcPr>
+          <w:p>
+            <w:r/>
+          </w:p>
+        </w:tc>
+        <w:tc>
+          <w:tcPr>
+            <w:tcW w:type="dxa" w:w="2523"/>
+          </w:tcPr>
+          <w:p>
+            <w:r/>
+          </w:p>
+        </w:tc>
+      </w:tr>
+    </w:tbl>
+    <w:p/>
+    <w:p>
+      <w:pPr>
+        <w:pStyle w:val="Heading2"/>
+      </w:pPr>
+      <w:r>
         <w:t>Kabul özeti</w:t>
       </w:r>
     </w:p>
@@ -5378,6 +6546,55 @@
                 <w:sz w:val="18"/>
               </w:rPr>
               <w:t>1</w:t>
+            </w:r>
+          </w:p>
+        </w:tc>
+        <w:tc>
+          <w:tcPr>
+            <w:tcW w:type="dxa" w:w="3028"/>
+          </w:tcPr>
+          <w:p>
+            <w:r/>
+          </w:p>
+        </w:tc>
+        <w:tc>
+          <w:tcPr>
+            <w:tcW w:type="dxa" w:w="3028"/>
+          </w:tcPr>
+          <w:p>
+            <w:r/>
+          </w:p>
+        </w:tc>
+        <w:tc>
+          <w:tcPr>
+            <w:tcW w:type="dxa" w:w="3028"/>
+          </w:tcPr>
+          <w:p>
+            <w:r/>
+          </w:p>
+        </w:tc>
+      </w:tr>
+      <w:tr>
+        <w:trPr>
+          <w:cantSplit/>
+        </w:trPr>
+        <w:tc>
+          <w:tcPr>
+            <w:tcW w:type="dxa" w:w="3028"/>
+          </w:tcPr>
+          <w:p>
+            <w:r>
+              <w:t>Cihaz Konfigürasyonu</w:t>
+            </w:r>
+          </w:p>
+        </w:tc>
+        <w:tc>
+          <w:tcPr>
+            <w:tcW w:type="dxa" w:w="3028"/>
+          </w:tcPr>
+          <w:p>
+            <w:r>
+              <w:t>17</w:t>
             </w:r>
           </w:p>
         </w:tc>

</xml_diff>

<commit_message>
UAT: K-18 (Swagger) ve veritabani betigi on kosulu eklendi (md, docx, pdf)
Co-Authored-By: Claude Sonnet 5.5 <noreply@anthropic.com>
</commit_message>
<xml_diff>
--- a/docs/UAT.docx
+++ b/docs/UAT.docx
@@ -4853,7 +4853,7 @@
     </w:p>
     <w:p>
       <w:r>
-        <w:t>Ön koşul: Admin kullanıcı; SICK TDC cihazı Config/Get çağırabiliyor (API adresi cihazda tanımlı). Admin olmayan bir test kullanıcısı.</w:t>
+        <w:t>Ön koşul: Admin kullanıcı; SICK TDC cihazı Config/Get çağırabiliyor (API adresi cihazda tanımlı). Admin olmayan bir test kullanıcısı. Veritabanında Migrations/Scripts/AddDollySettings.sql çalıştırılmış olmalı (EF migration geçmişi yoksa; aksi halde Dolly listesi PanoNo hatası verir).</w:t>
       </w:r>
     </w:p>
     <w:tbl>
@@ -5989,6 +5989,67 @@
           <w:p>
             <w:r>
               <w:t>Cihaz telemetri güncellemeleri (son görülme vb.) denetim kayıtlarını doldurmaz.</w:t>
+            </w:r>
+          </w:p>
+        </w:tc>
+        <w:tc>
+          <w:tcPr>
+            <w:tcW w:type="dxa" w:w="2523"/>
+          </w:tcPr>
+          <w:p>
+            <w:r/>
+          </w:p>
+        </w:tc>
+        <w:tc>
+          <w:tcPr>
+            <w:tcW w:type="dxa" w:w="2523"/>
+          </w:tcPr>
+          <w:p>
+            <w:r/>
+          </w:p>
+        </w:tc>
+      </w:tr>
+      <w:tr>
+        <w:trPr>
+          <w:cantSplit/>
+        </w:trPr>
+        <w:tc>
+          <w:tcPr>
+            <w:tcW w:type="dxa" w:w="2523"/>
+          </w:tcPr>
+          <w:p>
+            <w:r>
+              <w:t>K-18</w:t>
+            </w:r>
+          </w:p>
+        </w:tc>
+        <w:tc>
+          <w:tcPr>
+            <w:tcW w:type="dxa" w:w="2523"/>
+          </w:tcPr>
+          <w:p>
+            <w:r>
+              <w:t>–</w:t>
+            </w:r>
+          </w:p>
+        </w:tc>
+        <w:tc>
+          <w:tcPr>
+            <w:tcW w:type="dxa" w:w="2523"/>
+          </w:tcPr>
+          <w:p>
+            <w:r>
+              <w:t>API Swagger sayfasını aç (/swagger).</w:t>
+            </w:r>
+          </w:p>
+        </w:tc>
+        <w:tc>
+          <w:tcPr>
+            <w:tcW w:type="dxa" w:w="2523"/>
+          </w:tcPr>
+          <w:p>
+            <w:r>
+              <w:t>Sayfa hatasız yüklenir (swagger.json 200); Config altında Get, GetVsControl, DollyLog, Default, Devices, Publish, Events uçları listelenir.</w:t>
             </w:r>
           </w:p>
         </w:tc>
@@ -6594,7 +6655,7 @@
           </w:tcPr>
           <w:p>
             <w:r>
-              <w:t>17</w:t>
+              <w:t>18</w:t>
             </w:r>
           </w:p>
         </w:tc>

</xml_diff>